<commit_message>
connect database and run docker
</commit_message>
<xml_diff>
--- a/Nhật ký quá trình.docx
+++ b/Nhật ký quá trình.docx
@@ -332,22 +332,68 @@
             <w:tcW w:w="3063" w:type="dxa"/>
           </w:tcPr>
           <w:p>
-            <w:r>
-              <w:t>Viết Dockerfile cho Django và docker-compose.yml</w:t>
-            </w:r>
-          </w:p>
-        </w:tc>
-        <w:tc>
-          <w:tcPr>
-            <w:tcW w:w="3063" w:type="dxa"/>
-          </w:tcPr>
-          <w:p/>
+            <w:pPr>
+              <w:pStyle w:val="oancuaDanhsach"/>
+              <w:numPr>
+                <w:ilvl w:val="1"/>
+                <w:numId w:val="1"/>
+              </w:numPr>
+              <w:rPr>
+                <w:lang w:val="vi-VN"/>
+              </w:rPr>
+            </w:pPr>
+            <w:r>
+              <w:rPr>
+                <w:lang w:val="vi-VN"/>
+              </w:rPr>
+              <w:t xml:space="preserve"> Cấu hình kết nối cơ sở dữ liệu </w:t>
+            </w:r>
+            <w:r>
+              <w:t>PostgreSQL, tạo bảng dữ liệu cho bài viết</w:t>
+            </w:r>
+          </w:p>
+        </w:tc>
+        <w:tc>
+          <w:tcPr>
+            <w:tcW w:w="3063" w:type="dxa"/>
+          </w:tcPr>
+          <w:p>
+            <w:pPr>
+              <w:rPr>
+                <w:lang w:val="vi-VN"/>
+              </w:rPr>
+            </w:pPr>
+            <w:r>
+              <w:t>1</w:t>
+            </w:r>
+            <w:r>
+              <w:rPr>
+                <w:lang w:val="vi-VN"/>
+              </w:rPr>
+              <w:t>/10/2026</w:t>
+            </w:r>
+          </w:p>
         </w:tc>
         <w:tc>
           <w:tcPr>
             <w:tcW w:w="3064" w:type="dxa"/>
           </w:tcPr>
-          <w:p/>
+          <w:p>
+            <w:pPr>
+              <w:rPr>
+                <w:lang w:val="vi-VN"/>
+              </w:rPr>
+            </w:pPr>
+            <w:r>
+              <w:t>1</w:t>
+            </w:r>
+            <w:r>
+              <w:rPr>
+                <w:lang w:val="vi-VN"/>
+              </w:rPr>
+              <w:t>/10/2026</w:t>
+            </w:r>
+          </w:p>
         </w:tc>
       </w:tr>
       <w:tr>
@@ -1393,7 +1439,6 @@
   <w:style w:type="character" w:default="1" w:styleId="Phngmcinhcuaoanvn">
     <w:name w:val="Default Paragraph Font"/>
     <w:uiPriority w:val="1"/>
-    <w:semiHidden/>
     <w:unhideWhenUsed/>
   </w:style>
   <w:style w:type="table" w:default="1" w:styleId="BangThngthng">

</xml_diff>